<commit_message>
Refresh KY wisdom-story text and sync multilingual illustrations with rebuild tooling.
Land locale story/index updates, WebP illustration regenerations, and durable illustration prompt export/progress so the KY refresh and cross-locale art sync can continue.

Co-authored-by: Cursor <cursoragent@cursor.com>
</commit_message>
<xml_diff>
--- a/en/wisdom-stories/advice-for-those-who-marry.docx
+++ b/en/wisdom-stories/advice-for-those-who-marry.docx
@@ -4,190 +4,97 @@
   <w:body>
     <w:p>
       <w:pPr>
-        <w:spacing w:before="0" w:after="60"/>
-        <w:jc w:val="left"/>
+        <w:pStyle w:val="Title"/>
       </w:pPr>
       <w:r>
-        <w:rPr>
-          <w:rFonts w:ascii="Arial" w:hAnsi="Arial" w:eastAsia="Arial"/>
-          <w:i w:val="0"/>
-          <w:color w:val="000000"/>
-          <w:sz w:val="52"/>
-        </w:rPr>
-        <w:t>Advice for Those Who Marry</w:t>
+        <w:t>Advice for Newlyweds</w:t>
       </w:r>
     </w:p>
     <w:p>
       <w:pPr>
-        <w:jc w:val="left"/>
+        <w:spacing w:after="80"/>
       </w:pPr>
       <w:r>
-        <w:rPr>
-          <w:rFonts w:ascii="Arial" w:hAnsi="Arial" w:eastAsia="Arial"/>
-          <w:i w:val="0"/>
-          <w:color w:val="000000"/>
-          <w:sz w:val="22"/>
-        </w:rPr>
         <w:t>Wise elders offered the following counsel to a young couple beginning married life:</w:t>
       </w:r>
     </w:p>
     <w:p>
-      <w:pPr>
-        <w:jc w:val="left"/>
-      </w:pPr>
+      <w:pPr/>
       <w:r>
-        <w:rPr>
-          <w:rFonts w:ascii="Arial" w:hAnsi="Arial" w:eastAsia="Arial"/>
-          <w:i w:val="0"/>
-          <w:color w:val="000000"/>
-          <w:sz w:val="22"/>
-        </w:rPr>
         <w:t>“Do not compare your marriage with anyone else’s. Do not say, ‘Look at what that person’s husband is like,’ or ‘Look at what that person’s wife is like.’</w:t>
       </w:r>
     </w:p>
     <w:p>
-      <w:pPr>
-        <w:jc w:val="left"/>
-      </w:pPr>
+      <w:pPr/>
       <w:r>
-        <w:rPr>
-          <w:rFonts w:ascii="Arial" w:hAnsi="Arial" w:eastAsia="Arial"/>
-          <w:i w:val="0"/>
-          <w:color w:val="000000"/>
-          <w:sz w:val="22"/>
-        </w:rPr>
-        <w:t>Do not seek perfection; none of us is flawless. Do not investigate each other’s past—it is called the past for a reason.</w:t>
+        <w:t>Do not expect perfection; none of us is flawless. Do not dig into each other’s past—it is called the past for a reason.</w:t>
       </w:r>
     </w:p>
     <w:p>
-      <w:pPr>
-        <w:jc w:val="left"/>
-      </w:pPr>
+      <w:pPr/>
       <w:r>
-        <w:rPr>
-          <w:rFonts w:ascii="Arial" w:hAnsi="Arial" w:eastAsia="Arial"/>
-          <w:i w:val="0"/>
-          <w:color w:val="000000"/>
-          <w:sz w:val="22"/>
-        </w:rPr>
         <w:t>Do not expect your spouse to read your mind. No one can. Speak openly about your wishes and concerns, and try to resolve difficulties through conversation.</w:t>
       </w:r>
     </w:p>
     <w:p>
-      <w:pPr>
-        <w:jc w:val="left"/>
-      </w:pPr>
+      <w:pPr/>
       <w:r>
-        <w:rPr>
-          <w:rFonts w:ascii="Arial" w:hAnsi="Arial" w:eastAsia="Arial"/>
-          <w:i w:val="0"/>
-          <w:color w:val="000000"/>
-          <w:sz w:val="22"/>
-        </w:rPr>
         <w:t>Accept that alongside your shared life, each of you has a private world. Hedgehogs draw only as close as their spines allow; if they move too near, they hurt one another. Respect each other’s personal boundaries.</w:t>
       </w:r>
     </w:p>
     <w:p>
       <w:pPr>
-        <w:jc w:val="left"/>
+        <w:spacing w:after="80"/>
       </w:pPr>
       <w:r>
-        <w:rPr>
-          <w:rFonts w:ascii="Arial" w:hAnsi="Arial" w:eastAsia="Arial"/>
-          <w:i w:val="0"/>
-          <w:color w:val="000000"/>
-          <w:sz w:val="22"/>
-        </w:rPr>
         <w:t>In marriage, be neither owner nor servant, but companions on the same road.</w:t>
       </w:r>
     </w:p>
     <w:p>
-      <w:pPr>
-        <w:jc w:val="left"/>
-      </w:pPr>
+      <w:pPr/>
       <w:r>
-        <w:rPr>
-          <w:rFonts w:ascii="Arial" w:hAnsi="Arial" w:eastAsia="Arial"/>
-          <w:i w:val="0"/>
-          <w:color w:val="000000"/>
-          <w:sz w:val="22"/>
-        </w:rPr>
         <w:t>Do not promise, ‘Everything will always be wonderful.’ Say instead, ‘When life becomes difficult, I will be beside you.’</w:t>
       </w:r>
     </w:p>
     <w:p>
       <w:pPr>
-        <w:jc w:val="left"/>
+        <w:keepNext/>
       </w:pPr>
       <w:r>
-        <w:rPr>
-          <w:rFonts w:ascii="Arial" w:hAnsi="Arial" w:eastAsia="Arial"/>
-          <w:i w:val="0"/>
-          <w:color w:val="000000"/>
-          <w:sz w:val="22"/>
-        </w:rPr>
-        <w:t>Even if you have been upset with each other during the day, remember to say good night before sleeping. Let tomorrow begin with reconciliation.”</w:t>
+        <w:t>Even if you have been upset with each other during the day, remember to say good night before going to sleep. Let tomorrow begin with reconciliation.”</w:t>
       </w:r>
     </w:p>
     <w:p>
       <w:pPr>
-        <w:pStyle w:val="Moral"/>
         <w:keepNext/>
         <w:keepLines/>
-        <w:widowControl/>
-        <w:spacing w:before="240" w:after="180" w:line="283" w:lineRule="auto"/>
-        <w:ind w:left="240" w:right="240"/>
-        <w:jc w:val="left"/>
-        <w:pBdr>
-          <w:top w:val="single" w:sz="8" w:space="7" w:color="E8D59A"/>
-          <w:left w:val="single" w:sz="32" w:space="11" w:color="C6A23A"/>
-          <w:bottom w:val="single" w:sz="8" w:space="7" w:color="E8D59A"/>
-          <w:right w:val="single" w:sz="8" w:space="11" w:color="E8D59A"/>
-        </w:pBdr>
-        <w:shd w:val="clear" w:color="auto" w:fill="FFF8E1"/>
+        <w:spacing w:before="160"/>
       </w:pPr>
       <w:r>
         <w:rPr>
-          <w:rFonts w:ascii="Arial" w:hAnsi="Arial" w:eastAsia="Arial" w:cs="Arial"/>
           <w:b/>
-          <w:i w:val="0"/>
-          <w:color w:val="9A7417"/>
-          <w:sz w:val="22"/>
         </w:rPr>
-        <w:t xml:space="preserve">Moral: </w:t>
+        <w:t>Moral:</w:t>
       </w:r>
       <w:r>
-        <w:rPr>
-          <w:rFonts w:ascii="Arial" w:hAnsi="Arial" w:eastAsia="Arial" w:cs="Arial"/>
-          <w:b w:val="0"/>
-          <w:i w:val="0"/>
-          <w:color w:val="3F3826"/>
-          <w:sz w:val="22"/>
-        </w:rPr>
-        <w:t>A happy marriage rests not on comparison or the pursuit of perfection, but on open communication, mutual respect, and care for each other’s personal boundaries.</w:t>
+        <w:t xml:space="preserve"> A happy marriage rests not on comparison or the pursuit of perfection, but on open communication, mutual respect, and care for each other’s personal boundaries.</w:t>
       </w:r>
     </w:p>
     <w:p>
       <w:pPr>
-        <w:keepLines/>
-        <w:widowControl/>
-        <w:spacing w:before="60" w:after="0" w:line="240" w:lineRule="auto"/>
-        <w:jc w:val="right"/>
+        <w:spacing w:after="80"/>
       </w:pPr>
       <w:r>
         <w:rPr>
-          <w:rFonts w:ascii="Arial" w:hAnsi="Arial" w:eastAsia="Arial" w:cs="Arial"/>
-          <w:b w:val="0"/>
           <w:i/>
-          <w:color w:val="8A7950"/>
-          <w:sz w:val="17"/>
+          <w:sz w:val="18"/>
         </w:rPr>
-        <w:t>The story was obtained from open Internet sources.</w:t>
+        <w:t>Source: Publicly available internet sources.</w:t>
       </w:r>
     </w:p>
     <w:sectPr>
       <w:pgSz w:w="12240" w:h="15840"/>
-      <w:pgMar w:top="1440" w:right="1440" w:bottom="1440" w:left="1440" w:header="708" w:footer="708" w:gutter="0"/>
+      <w:pgMar w:top="1080" w:right="1224" w:bottom="1080" w:left="1224" w:header="720" w:footer="720" w:gutter="0"/>
       <w:cols w:space="720"/>
       <w:docGrid w:linePitch="360"/>
     </w:sectPr>
@@ -559,12 +466,14 @@
     <w:qFormat/>
     <w:rsid w:val="00FC693F"/>
     <w:pPr>
-      <w:spacing w:before="0" w:after="160" w:line="276" w:lineRule="auto"/>
+      <w:widowControl/>
+      <w:spacing w:after="120" w:line="259" w:lineRule="auto"/>
     </w:pPr>
     <w:rPr>
-      <w:rFonts w:ascii="Arial" w:hAnsi="Arial" w:eastAsia="Arial"/>
+      <w:rFonts w:ascii="Arial" w:hAnsi="Arial"/>
       <w:color w:val="000000"/>
       <w:sz w:val="22"/>
+      <w:lang w:val="en-US"/>
     </w:rPr>
   </w:style>
   <w:style w:type="paragraph" w:styleId="Header">
@@ -908,18 +817,17 @@
     <w:qFormat/>
     <w:rsid w:val="00FC693F"/>
     <w:pPr>
-      <w:pBdr>
-        <w:bottom w:val="single" w:sz="8" w:space="4" w:color="4F81BD" w:themeColor="accent1"/>
-      </w:pBdr>
-      <w:spacing w:after="300" w:line="240" w:lineRule="auto"/>
+      <w:keepNext/>
+      <w:spacing w:after="280" w:line="240" w:lineRule="auto"/>
       <w:contextualSpacing/>
     </w:pPr>
     <w:rPr>
-      <w:rFonts w:asciiTheme="majorHAnsi" w:eastAsiaTheme="majorEastAsia" w:hAnsiTheme="majorHAnsi" w:cstheme="majorBidi"/>
-      <w:color w:val="17365D" w:themeColor="text2" w:themeShade="BF"/>
+      <w:rFonts w:asciiTheme="majorHAnsi" w:eastAsiaTheme="majorEastAsia" w:hAnsiTheme="majorHAnsi" w:cstheme="majorBidi" w:ascii="Arial" w:hAnsi="Arial"/>
+      <w:b/>
+      <w:color w:val="000000"/>
       <w:spacing w:val="5"/>
       <w:kern w:val="28"/>
-      <w:sz w:val="52"/>
+      <w:sz w:val="34"/>
       <w:szCs w:val="52"/>
     </w:rPr>
   </w:style>
@@ -1395,9 +1303,6 @@
     <w:qFormat/>
     <w:rsid w:val="00FC693F"/>
     <w:pPr>
-      <w:pBdr>
-        <w:bottom w:val="single" w:sz="4" w:space="4" w:color="4F81BD" w:themeColor="accent1"/>
-      </w:pBdr>
       <w:spacing w:before="200" w:after="280"/>
       <w:ind w:left="936" w:right="936"/>
     </w:pPr>
@@ -12248,18 +12153,6 @@
         <w:shd w:val="clear" w:color="auto" w:fill="FBCAA2" w:themeFill="accent6" w:themeFillTint="7F"/>
       </w:tcPr>
     </w:tblStylePr>
-  </w:style>
-  <w:style w:type="paragraph" w:customStyle="1" w:styleId="Moral">
-    <w:name w:val="Moral"/>
-    <w:basedOn w:val="Normal"/>
-    <w:pPr>
-      <w:spacing w:before="160" w:after="0" w:line="276" w:lineRule="auto"/>
-    </w:pPr>
-    <w:rPr>
-      <w:rFonts w:ascii="Arial" w:hAnsi="Arial" w:eastAsia="Arial"/>
-      <w:i/>
-      <w:sz w:val="22"/>
-    </w:rPr>
   </w:style>
 </w:styles>
 </file>

</xml_diff>

<commit_message>
Update wisdom-story texts and illustrations so every language uses the same pictures, with frames matched to the Azerbaijani versions.
Co-authored-by: Cursor <cursoragent@cursor.com>
</commit_message>
<xml_diff>
--- a/en/wisdom-stories/advice-for-those-who-marry.docx
+++ b/en/wisdom-stories/advice-for-those-who-marry.docx
@@ -27,7 +27,7 @@
     <w:p>
       <w:pPr/>
       <w:r>
-        <w:t>Do not expect perfection; none of us is flawless. Do not dig into each other’s past—it is called the past for a reason.</w:t>
+        <w:t>Do not look for a flawless person; none of us is flawless. Do not dig into each other’s past—let what has passed stay in the past.</w:t>
       </w:r>
     </w:p>
     <w:p>
@@ -47,7 +47,7 @@
         <w:spacing w:after="80"/>
       </w:pPr>
       <w:r>
-        <w:t>In marriage, be neither owner nor servant, but companions on the same road.</w:t>
+        <w:t>In marriage, be neither owner nor slave, but companions on the same road.</w:t>
       </w:r>
     </w:p>
     <w:p>
@@ -74,11 +74,9 @@
         <w:rPr>
           <w:b/>
         </w:rPr>
-        <w:t>Moral:</w:t>
+        <w:t>Moral: A happy marriage rests not on comparison or the pursuit of perfection, but on open communication, mutual respect, and care for each other’s personal boundaries.</w:t>
       </w:r>
-      <w:r>
-        <w:t xml:space="preserve"> A happy marriage rests not on comparison or the pursuit of perfection, but on open communication, mutual respect, and care for each other’s personal boundaries.</w:t>
-      </w:r>
+      <w:r/>
     </w:p>
     <w:p>
       <w:pPr>
@@ -89,7 +87,7 @@
           <w:i/>
           <w:sz w:val="18"/>
         </w:rPr>
-        <w:t>Source: Publicly available internet sources.</w:t>
+        <w:t>Stories are taken from open Internet sources; illustrations were created with AI.</w:t>
       </w:r>
     </w:p>
     <w:sectPr>

</xml_diff>